<commit_message>
Update technical report with real results
RF Val F1=0.796 / Test F1=0.919
AE Recall=0.557 Precision=0.906
RL Q-Learning COT=4792 Recall=0.986 (constraint OK)
RF Argmax baseline COT=-737 Recall=0.998
</commit_message>
<xml_diff>
--- a/reports/Reporte_Tecnico_NetworkAnomalyDetection.docx
+++ b/reports/Reporte_Tecnico_NetworkAnomalyDetection.docx
@@ -7306,7 +7306,7 @@
           <w:sz w:val="26"/>
           <w:szCs w:val="26"/>
         </w:rPr>
-        <w:t xml:space="preserve">4.4 Resultados de Modelado ML (Validation)</w:t>
+        <w:t xml:space="preserve">4.4 Resultados de Modelado ML</w:t>
       </w:r>
     </w:p>
     <w:p>
@@ -7321,7 +7321,7 @@
           <w:sz w:val="22"/>
           <w:szCs w:val="22"/>
         </w:rPr>
-        <w:t xml:space="preserve">Los resultados de validación se generan al ejecutar el notebook 03_modeling.ipynb. La tabla comparativa completa se encuentra en reports/model_comparison_val.csv una vez ejecutado.</w:t>
+        <w:t xml:space="preserve">El Random Forest fue el único clasificador ejecutable en el entorno local (Apple Silicon M1) debido a incompatibilidad de arquitectura ARM64/x86_64 con los Python workers de Spark para GBT OneVsRest. El RF con CrossValidator k=5 y pesos de clase obtuvo los siguientes resultados:</w:t>
       </w:r>
     </w:p>
     <w:p>
@@ -7654,7 +7654,7 @@
                 <w:sz w:val="20"/>
                 <w:szCs w:val="20"/>
               </w:rPr>
-              <w:t xml:space="preserve">Random Forest</w:t>
+              <w:t xml:space="preserve">Random Forest (Val)</w:t>
             </w:r>
           </w:p>
         </w:tc>
@@ -7688,7 +7688,7 @@
                 <w:sz w:val="20"/>
                 <w:szCs w:val="20"/>
               </w:rPr>
-              <w:t xml:space="preserve">Ver CSV</w:t>
+              <w:t xml:space="preserve">0.796</w:t>
             </w:r>
           </w:p>
         </w:tc>
@@ -7722,7 +7722,7 @@
                 <w:sz w:val="20"/>
                 <w:szCs w:val="20"/>
               </w:rPr>
-              <w:t xml:space="preserve">—</w:t>
+              <w:t xml:space="preserve">1.000</w:t>
             </w:r>
           </w:p>
         </w:tc>
@@ -7756,7 +7756,7 @@
                 <w:sz w:val="20"/>
                 <w:szCs w:val="20"/>
               </w:rPr>
-              <w:t xml:space="preserve">—</w:t>
+              <w:t xml:space="preserve">0.994</w:t>
             </w:r>
           </w:p>
         </w:tc>
@@ -7790,7 +7790,7 @@
                 <w:sz w:val="20"/>
                 <w:szCs w:val="20"/>
               </w:rPr>
-              <w:t xml:space="preserve">—</w:t>
+              <w:t xml:space="preserve">0.985</w:t>
             </w:r>
           </w:p>
         </w:tc>
@@ -7803,28 +7803,28 @@
               <w:bottom w:val="single" w:color="CCCCCC" w:sz="1"/>
               <w:right w:val="single" w:color="CCCCCC" w:sz="1"/>
             </w:tcBorders>
-            <w:shd w:fill="FFFFFF" w:val="clear"/>
-            <w:tcMar>
-              <w:top w:type="dxa" w:w="80"/>
-              <w:left w:type="dxa" w:w="140"/>
-              <w:bottom w:type="dxa" w:w="80"/>
-              <w:right w:type="dxa" w:w="140"/>
-            </w:tcMar>
-          </w:tcPr>
-          <w:p>
-            <w:pPr>
-              <w:jc w:val="center"/>
-            </w:pPr>
-            <w:r>
-              <w:rPr>
-                <w:rFonts w:ascii="Arial" w:cs="Arial" w:eastAsia="Arial" w:hAnsi="Arial"/>
-                <w:b w:val="false"/>
-                <w:bCs w:val="false"/>
-                <w:color w:val="2D2D2D"/>
-                <w:sz w:val="20"/>
-                <w:szCs w:val="20"/>
-              </w:rPr>
-              <w:t xml:space="preserve">—</w:t>
+            <w:shd w:fill="FFF2CC" w:val="clear"/>
+            <w:tcMar>
+              <w:top w:type="dxa" w:w="80"/>
+              <w:left w:type="dxa" w:w="140"/>
+              <w:bottom w:type="dxa" w:w="80"/>
+              <w:right w:type="dxa" w:w="140"/>
+            </w:tcMar>
+          </w:tcPr>
+          <w:p>
+            <w:pPr>
+              <w:jc w:val="center"/>
+            </w:pPr>
+            <w:r>
+              <w:rPr>
+                <w:rFonts w:ascii="Arial" w:cs="Arial" w:eastAsia="Arial" w:hAnsi="Arial"/>
+                <w:b w:val="false"/>
+                <w:bCs w:val="false"/>
+                <w:color w:val="2D2D2D"/>
+                <w:sz w:val="20"/>
+                <w:szCs w:val="20"/>
+              </w:rPr>
+              <w:t xml:space="preserve">0.167</w:t>
             </w:r>
           </w:p>
         </w:tc>
@@ -7860,7 +7860,7 @@
                 <w:sz w:val="20"/>
                 <w:szCs w:val="20"/>
               </w:rPr>
-              <w:t xml:space="preserve">GBT One-vs-Rest</w:t>
+              <w:t xml:space="preserve">Random Forest (Test)</w:t>
             </w:r>
           </w:p>
         </w:tc>
@@ -7873,28 +7873,28 @@
               <w:bottom w:val="single" w:color="CCCCCC" w:sz="1"/>
               <w:right w:val="single" w:color="CCCCCC" w:sz="1"/>
             </w:tcBorders>
-            <w:shd w:fill="EBF3FB" w:val="clear"/>
-            <w:tcMar>
-              <w:top w:type="dxa" w:w="80"/>
-              <w:left w:type="dxa" w:w="140"/>
-              <w:bottom w:type="dxa" w:w="80"/>
-              <w:right w:type="dxa" w:w="140"/>
-            </w:tcMar>
-          </w:tcPr>
-          <w:p>
-            <w:pPr>
-              <w:jc w:val="center"/>
-            </w:pPr>
-            <w:r>
-              <w:rPr>
-                <w:rFonts w:ascii="Arial" w:cs="Arial" w:eastAsia="Arial" w:hAnsi="Arial"/>
-                <w:b w:val="false"/>
-                <w:bCs w:val="false"/>
-                <w:color w:val="2D2D2D"/>
-                <w:sz w:val="20"/>
-                <w:szCs w:val="20"/>
-              </w:rPr>
-              <w:t xml:space="preserve">Ver CSV</w:t>
+            <w:shd w:fill="D5E8D4" w:val="clear"/>
+            <w:tcMar>
+              <w:top w:type="dxa" w:w="80"/>
+              <w:left w:type="dxa" w:w="140"/>
+              <w:bottom w:type="dxa" w:w="80"/>
+              <w:right w:type="dxa" w:w="140"/>
+            </w:tcMar>
+          </w:tcPr>
+          <w:p>
+            <w:pPr>
+              <w:jc w:val="center"/>
+            </w:pPr>
+            <w:r>
+              <w:rPr>
+                <w:rFonts w:ascii="Arial" w:cs="Arial" w:eastAsia="Arial" w:hAnsi="Arial"/>
+                <w:b w:val="false"/>
+                <w:bCs w:val="false"/>
+                <w:color w:val="2D2D2D"/>
+                <w:sz w:val="20"/>
+                <w:szCs w:val="20"/>
+              </w:rPr>
+              <w:t xml:space="preserve">0.919</w:t>
             </w:r>
           </w:p>
         </w:tc>
@@ -8256,7 +8256,7 @@
           <w:sz w:val="18"/>
           <w:szCs w:val="18"/>
         </w:rPr>
-        <w:t xml:space="preserve">Tabla 9. Comparativa de modelos ML en Validation. El RF de Databricks es el baseline sin pesos de clase.</w:t>
+        <w:t xml:space="preserve">Tabla 9. Resultados Random Forest. Val F1-macro bajo por U2R (solo 6 muestras). Test F1 sube a 0.919 por distribution shift de R2L. Databricks RF = baseline sin pesos de clase.</w:t>
       </w:r>
     </w:p>
     <w:p>
@@ -10150,7 +10150,7 @@
                 <w:sz w:val="20"/>
                 <w:szCs w:val="20"/>
               </w:rPr>
-              <w:t xml:space="preserve">—</w:t>
+              <w:t xml:space="preserve">38,211</w:t>
             </w:r>
           </w:p>
         </w:tc>
@@ -10184,7 +10184,7 @@
                 <w:sz w:val="20"/>
                 <w:szCs w:val="20"/>
               </w:rPr>
-              <w:t xml:space="preserve">—</w:t>
+              <w:t xml:space="preserve">2.069</w:t>
             </w:r>
           </w:p>
         </w:tc>
@@ -10218,7 +10218,7 @@
                 <w:sz w:val="20"/>
                 <w:szCs w:val="20"/>
               </w:rPr>
-              <w:t xml:space="preserve">—</w:t>
+              <w:t xml:space="preserve">1.000</w:t>
             </w:r>
           </w:p>
         </w:tc>
@@ -10252,7 +10252,7 @@
                 <w:sz w:val="20"/>
                 <w:szCs w:val="20"/>
               </w:rPr>
-              <w:t xml:space="preserve">—</w:t>
+              <w:t xml:space="preserve">✓</w:t>
             </w:r>
           </w:p>
         </w:tc>
@@ -10322,7 +10322,7 @@
                 <w:sz w:val="20"/>
                 <w:szCs w:val="20"/>
               </w:rPr>
-              <w:t xml:space="preserve">—</w:t>
+              <w:t xml:space="preserve">1,724</w:t>
             </w:r>
           </w:p>
         </w:tc>
@@ -10356,7 +10356,7 @@
                 <w:sz w:val="20"/>
                 <w:szCs w:val="20"/>
               </w:rPr>
-              <w:t xml:space="preserve">—</w:t>
+              <w:t xml:space="preserve">0.093</w:t>
             </w:r>
           </w:p>
         </w:tc>
@@ -10390,7 +10390,7 @@
                 <w:sz w:val="20"/>
                 <w:szCs w:val="20"/>
               </w:rPr>
-              <w:t xml:space="preserve">—</w:t>
+              <w:t xml:space="preserve">0.956</w:t>
             </w:r>
           </w:p>
         </w:tc>
@@ -10424,7 +10424,7 @@
                 <w:sz w:val="20"/>
                 <w:szCs w:val="20"/>
               </w:rPr>
-              <w:t xml:space="preserve">—</w:t>
+              <w:t xml:space="preserve">✓</w:t>
             </w:r>
           </w:p>
         </w:tc>
@@ -10460,7 +10460,7 @@
                 <w:sz w:val="20"/>
                 <w:szCs w:val="20"/>
               </w:rPr>
-              <w:t xml:space="preserve">GBT Argmax</w:t>
+              <w:t xml:space="preserve">RF Argmax (sin RL)</w:t>
             </w:r>
           </w:p>
         </w:tc>
@@ -10473,28 +10473,28 @@
               <w:bottom w:val="single" w:color="CCCCCC" w:sz="1"/>
               <w:right w:val="single" w:color="CCCCCC" w:sz="1"/>
             </w:tcBorders>
-            <w:shd w:fill="FFFFFF" w:val="clear"/>
-            <w:tcMar>
-              <w:top w:type="dxa" w:w="80"/>
-              <w:left w:type="dxa" w:w="140"/>
-              <w:bottom w:type="dxa" w:w="80"/>
-              <w:right w:type="dxa" w:w="140"/>
-            </w:tcMar>
-          </w:tcPr>
-          <w:p>
-            <w:pPr>
-              <w:jc w:val="center"/>
-            </w:pPr>
-            <w:r>
-              <w:rPr>
-                <w:rFonts w:ascii="Arial" w:cs="Arial" w:eastAsia="Arial" w:hAnsi="Arial"/>
-                <w:b w:val="false"/>
-                <w:bCs w:val="false"/>
-                <w:color w:val="2D2D2D"/>
-                <w:sz w:val="20"/>
-                <w:szCs w:val="20"/>
-              </w:rPr>
-              <w:t xml:space="preserve">—</w:t>
+            <w:shd w:fill="D5E8D4" w:val="clear"/>
+            <w:tcMar>
+              <w:top w:type="dxa" w:w="80"/>
+              <w:left w:type="dxa" w:w="140"/>
+              <w:bottom w:type="dxa" w:w="80"/>
+              <w:right w:type="dxa" w:w="140"/>
+            </w:tcMar>
+          </w:tcPr>
+          <w:p>
+            <w:pPr>
+              <w:jc w:val="center"/>
+            </w:pPr>
+            <w:r>
+              <w:rPr>
+                <w:rFonts w:ascii="Arial" w:cs="Arial" w:eastAsia="Arial" w:hAnsi="Arial"/>
+                <w:b w:val="false"/>
+                <w:bCs w:val="false"/>
+                <w:color w:val="2D2D2D"/>
+                <w:sz w:val="20"/>
+                <w:szCs w:val="20"/>
+              </w:rPr>
+              <w:t xml:space="preserve">-737</w:t>
             </w:r>
           </w:p>
         </w:tc>
@@ -10507,28 +10507,28 @@
               <w:bottom w:val="single" w:color="CCCCCC" w:sz="1"/>
               <w:right w:val="single" w:color="CCCCCC" w:sz="1"/>
             </w:tcBorders>
-            <w:shd w:fill="FFFFFF" w:val="clear"/>
-            <w:tcMar>
-              <w:top w:type="dxa" w:w="80"/>
-              <w:left w:type="dxa" w:w="140"/>
-              <w:bottom w:type="dxa" w:w="80"/>
-              <w:right w:type="dxa" w:w="140"/>
-            </w:tcMar>
-          </w:tcPr>
-          <w:p>
-            <w:pPr>
-              <w:jc w:val="center"/>
-            </w:pPr>
-            <w:r>
-              <w:rPr>
-                <w:rFonts w:ascii="Arial" w:cs="Arial" w:eastAsia="Arial" w:hAnsi="Arial"/>
-                <w:b w:val="false"/>
-                <w:bCs w:val="false"/>
-                <w:color w:val="2D2D2D"/>
-                <w:sz w:val="20"/>
-                <w:szCs w:val="20"/>
-              </w:rPr>
-              <w:t xml:space="preserve">—</w:t>
+            <w:shd w:fill="D5E8D4" w:val="clear"/>
+            <w:tcMar>
+              <w:top w:type="dxa" w:w="80"/>
+              <w:left w:type="dxa" w:w="140"/>
+              <w:bottom w:type="dxa" w:w="80"/>
+              <w:right w:type="dxa" w:w="140"/>
+            </w:tcMar>
+          </w:tcPr>
+          <w:p>
+            <w:pPr>
+              <w:jc w:val="center"/>
+            </w:pPr>
+            <w:r>
+              <w:rPr>
+                <w:rFonts w:ascii="Arial" w:cs="Arial" w:eastAsia="Arial" w:hAnsi="Arial"/>
+                <w:b w:val="false"/>
+                <w:bCs w:val="false"/>
+                <w:color w:val="2D2D2D"/>
+                <w:sz w:val="20"/>
+                <w:szCs w:val="20"/>
+              </w:rPr>
+              <w:t xml:space="preserve">-0.040</w:t>
             </w:r>
           </w:p>
         </w:tc>
@@ -10562,7 +10562,7 @@
                 <w:sz w:val="20"/>
                 <w:szCs w:val="20"/>
               </w:rPr>
-              <w:t xml:space="preserve">—</w:t>
+              <w:t xml:space="preserve">0.998</w:t>
             </w:r>
           </w:p>
         </w:tc>
@@ -10596,7 +10596,7 @@
                 <w:sz w:val="20"/>
                 <w:szCs w:val="20"/>
               </w:rPr>
-              <w:t xml:space="preserve">—</w:t>
+              <w:t xml:space="preserve">✓</w:t>
             </w:r>
           </w:p>
         </w:tc>
@@ -10645,28 +10645,28 @@
               <w:bottom w:val="single" w:color="CCCCCC" w:sz="1"/>
               <w:right w:val="single" w:color="CCCCCC" w:sz="1"/>
             </w:tcBorders>
-            <w:shd w:fill="FFFFFF" w:val="clear"/>
-            <w:tcMar>
-              <w:top w:type="dxa" w:w="80"/>
-              <w:left w:type="dxa" w:w="140"/>
-              <w:bottom w:type="dxa" w:w="80"/>
-              <w:right w:type="dxa" w:w="140"/>
-            </w:tcMar>
-          </w:tcPr>
-          <w:p>
-            <w:pPr>
-              <w:jc w:val="center"/>
-            </w:pPr>
-            <w:r>
-              <w:rPr>
-                <w:rFonts w:ascii="Arial" w:cs="Arial" w:eastAsia="Arial" w:hAnsi="Arial"/>
-                <w:b w:val="false"/>
-                <w:bCs w:val="false"/>
-                <w:color w:val="2D2D2D"/>
-                <w:sz w:val="20"/>
-                <w:szCs w:val="20"/>
-              </w:rPr>
-              <w:t xml:space="preserve">—</w:t>
+            <w:shd w:fill="EBF3FB" w:val="clear"/>
+            <w:tcMar>
+              <w:top w:type="dxa" w:w="80"/>
+              <w:left w:type="dxa" w:w="140"/>
+              <w:bottom w:type="dxa" w:w="80"/>
+              <w:right w:type="dxa" w:w="140"/>
+            </w:tcMar>
+          </w:tcPr>
+          <w:p>
+            <w:pPr>
+              <w:jc w:val="center"/>
+            </w:pPr>
+            <w:r>
+              <w:rPr>
+                <w:rFonts w:ascii="Arial" w:cs="Arial" w:eastAsia="Arial" w:hAnsi="Arial"/>
+                <w:b w:val="false"/>
+                <w:bCs w:val="false"/>
+                <w:color w:val="2D2D2D"/>
+                <w:sz w:val="20"/>
+                <w:szCs w:val="20"/>
+              </w:rPr>
+              <w:t xml:space="preserve">4,792</w:t>
             </w:r>
           </w:p>
         </w:tc>
@@ -10679,28 +10679,28 @@
               <w:bottom w:val="single" w:color="CCCCCC" w:sz="1"/>
               <w:right w:val="single" w:color="CCCCCC" w:sz="1"/>
             </w:tcBorders>
-            <w:shd w:fill="FFFFFF" w:val="clear"/>
-            <w:tcMar>
-              <w:top w:type="dxa" w:w="80"/>
-              <w:left w:type="dxa" w:w="140"/>
-              <w:bottom w:type="dxa" w:w="80"/>
-              <w:right w:type="dxa" w:w="140"/>
-            </w:tcMar>
-          </w:tcPr>
-          <w:p>
-            <w:pPr>
-              <w:jc w:val="center"/>
-            </w:pPr>
-            <w:r>
-              <w:rPr>
-                <w:rFonts w:ascii="Arial" w:cs="Arial" w:eastAsia="Arial" w:hAnsi="Arial"/>
-                <w:b w:val="false"/>
-                <w:bCs w:val="false"/>
-                <w:color w:val="2D2D2D"/>
-                <w:sz w:val="20"/>
-                <w:szCs w:val="20"/>
-              </w:rPr>
-              <w:t xml:space="preserve">—</w:t>
+            <w:shd w:fill="EBF3FB" w:val="clear"/>
+            <w:tcMar>
+              <w:top w:type="dxa" w:w="80"/>
+              <w:left w:type="dxa" w:w="140"/>
+              <w:bottom w:type="dxa" w:w="80"/>
+              <w:right w:type="dxa" w:w="140"/>
+            </w:tcMar>
+          </w:tcPr>
+          <w:p>
+            <w:pPr>
+              <w:jc w:val="center"/>
+            </w:pPr>
+            <w:r>
+              <w:rPr>
+                <w:rFonts w:ascii="Arial" w:cs="Arial" w:eastAsia="Arial" w:hAnsi="Arial"/>
+                <w:b w:val="false"/>
+                <w:bCs w:val="false"/>
+                <w:color w:val="2D2D2D"/>
+                <w:sz w:val="20"/>
+                <w:szCs w:val="20"/>
+              </w:rPr>
+              <w:t xml:space="preserve">0.260</w:t>
             </w:r>
           </w:p>
         </w:tc>
@@ -10734,7 +10734,7 @@
                 <w:sz w:val="20"/>
                 <w:szCs w:val="20"/>
               </w:rPr>
-              <w:t xml:space="preserve">—</w:t>
+              <w:t xml:space="preserve">0.986</w:t>
             </w:r>
           </w:p>
         </w:tc>
@@ -10768,7 +10768,7 @@
                 <w:sz w:val="20"/>
                 <w:szCs w:val="20"/>
               </w:rPr>
-              <w:t xml:space="preserve">—</w:t>
+              <w:t xml:space="preserve">✓</w:t>
             </w:r>
           </w:p>
         </w:tc>
@@ -10788,7 +10788,7 @@
           <w:sz w:val="18"/>
           <w:szCs w:val="18"/>
         </w:rPr>
-        <w:t xml:space="preserve">Tabla 13. Resultados FINALES en Test — pendiente de ejecutar notebook 04</w:t>
+        <w:t xml:space="preserve">Tabla 13. Resultados FINALES en Test. COT negativo = ahorro neto. Las 4 políticas cumplen Recall ≥ 0.90.</w:t>
       </w:r>
     </w:p>
     <w:p>
@@ -11763,7 +11763,7 @@
       <w:pPr>
         <w:spacing w:after="100" w:before="60"/>
       </w:pPr>
-      <w:hyperlink w:history="1" r:id="rIdp-skz-gqdehdjoarsmlyw">
+      <w:hyperlink w:history="1" r:id="rIdzjd38mxry13nobkyp2cpw">
         <w:r>
           <w:rPr>
             <w:rStyle w:val="Hyperlink"/>
@@ -11945,7 +11945,7 @@
           <w:sz w:val="22"/>
           <w:szCs w:val="22"/>
         </w:rPr>
-        <w:t xml:space="preserve">El distribution shift de R2L (0.79% → 10.75%) es un desafío real que los modelos deben manejar con generalización, no memorización.</w:t>
+        <w:t xml:space="preserve">El distribution shift de R2L (0.79% → 10.75%) es intencional en NSL-KDD: el RF generaliza bien, subiendo de F1=0.796 en val a 0.919 en test gracias a más muestras R2L.</w:t>
       </w:r>
     </w:p>
     <w:p>
@@ -11964,7 +11964,7 @@
           <w:sz w:val="22"/>
           <w:szCs w:val="22"/>
         </w:rPr>
-        <w:t xml:space="preserve">Los pesos de clase son críticos: el baseline sin pesos (Databricks) obtuvo F1=0.70, significativamente inferior al pipeline con pesos.</w:t>
+        <w:t xml:space="preserve">Los pesos de clase son críticos: el baseline sin pesos (Databricks RF) obtuvo F1=0.70, frente a 0.919 del pipeline con CrossValidator y pesos.</w:t>
       </w:r>
     </w:p>
     <w:p>
@@ -11983,7 +11983,26 @@
           <w:sz w:val="22"/>
           <w:szCs w:val="22"/>
         </w:rPr>
-        <w:t xml:space="preserve">La métrica COT es más representativa que la accuracy para problemas de seguridad donde el costo de los errores es asimétrico.</w:t>
+        <w:t xml:space="preserve">El agente Q-Learning con 15 épocas no superó al baseline RF Argmax (COT=-737 vs 4,792). Esto indica que cuando el clasificador base ya es muy preciso (99.5%), el RL necesita más épocas o ajuste de hiperparámetros de recompensa para encontrar una política superior.</w:t>
+      </w:r>
+    </w:p>
+    <w:p>
+      <w:pPr>
+        <w:pStyle w:val="ListParagraph"/>
+        <w:numPr>
+          <w:ilvl w:val="0"/>
+          <w:numId w:val="2"/>
+        </w:numPr>
+        <w:spacing w:after="40" w:before="40"/>
+      </w:pPr>
+      <w:r>
+        <w:rPr>
+          <w:rFonts w:ascii="Arial" w:cs="Arial" w:eastAsia="Arial" w:hAnsi="Arial"/>
+          <w:color w:val="2D2D2D"/>
+          <w:sz w:val="22"/>
+          <w:szCs w:val="22"/>
+        </w:rPr>
+        <w:t xml:space="preserve">La incompatibilidad de arquitectura ARM64/x86_64 en macOS M1 con PySpark Python workers impidió correr GBT OneVsRest — documentado como limitación del entorno local; en Databricks (x86_64) el GBT sí funciona correctamente.</w:t>
       </w:r>
     </w:p>
     <w:p>

</xml_diff>